<commit_message>
feat: consolidate process governance and PMO workflows
</commit_message>
<xml_diff>
--- a/docs/norms/质量管理部业务资料/昌兴程序/SYCXQMS-M2-04 管理评审程序/管理评审程序 正文.docx
+++ b/docs/norms/质量管理部业务资料/昌兴程序/SYCXQMS-M2-04 管理评审程序/管理评审程序 正文.docx
@@ -1,6 +1,6 @@
 
 <file path=word/document.xml><?xml version="1.0" encoding="utf-8"?>
-<w:document xmlns:wpc="http://schemas.microsoft.com/office/word/2010/wordprocessingCanvas" xmlns:cx="http://schemas.microsoft.com/office/drawing/2014/chartex" xmlns:cx1="http://schemas.microsoft.com/office/drawing/2015/9/8/chartex" xmlns:cx2="http://schemas.microsoft.com/office/drawing/2015/10/21/chartex" xmlns:cx3="http://schemas.microsoft.com/office/drawing/2016/5/9/chartex" xmlns:cx4="http://schemas.microsoft.com/office/drawing/2016/5/10/chartex" xmlns:cx5="http://schemas.microsoft.com/office/drawing/2016/5/11/chartex" xmlns:cx6="http://schemas.microsoft.com/office/drawing/2016/5/12/chartex" xmlns:cx7="http://schemas.microsoft.com/office/drawing/2016/5/13/chartex" xmlns:cx8="http://schemas.microsoft.com/office/drawing/2016/5/14/chartex" xmlns:mc="http://schemas.openxmlformats.org/markup-compatibility/2006" xmlns:aink="http://schemas.microsoft.com/office/drawing/2016/ink" xmlns:am3d="http://schemas.microsoft.com/office/drawing/2017/model3d" xmlns:o="urn:schemas-microsoft-com:office:office" xmlns:oel="http://schemas.microsoft.com/office/2019/extlst" xmlns:r="http://schemas.openxmlformats.org/officeDocument/2006/relationships" xmlns:m="http://schemas.openxmlformats.org/officeDocument/2006/math" xmlns:v="urn:schemas-microsoft-com:vml" xmlns:wp14="http://schemas.microsoft.com/office/word/2010/wordprocessingDrawing" xmlns:wp="http://schemas.openxmlformats.org/drawingml/2006/wordprocessingDrawing" xmlns:w10="urn:schemas-microsoft-com:office:word" xmlns:w="http://schemas.openxmlformats.org/wordprocessingml/2006/main" xmlns:w14="http://schemas.microsoft.com/office/word/2010/wordml" xmlns:w15="http://schemas.microsoft.com/office/word/2012/wordml" xmlns:w16cex="http://schemas.microsoft.com/office/word/2018/wordml/cex" xmlns:w16cid="http://schemas.microsoft.com/office/word/2016/wordml/cid" xmlns:w16="http://schemas.microsoft.com/office/word/2018/wordml" xmlns:w16du="http://schemas.microsoft.com/office/word/2023/wordml/word16du" xmlns:w16sdtdh="http://schemas.microsoft.com/office/word/2020/wordml/sdtdatahash" xmlns:w16sdtfl="http://schemas.microsoft.com/office/word/2024/wordml/sdtformatlock" xmlns:w16se="http://schemas.microsoft.com/office/word/2015/wordml/symex" xmlns:wpg="http://schemas.microsoft.com/office/word/2010/wordprocessingGroup" xmlns:wpi="http://schemas.microsoft.com/office/word/2010/wordprocessingInk" xmlns:wne="http://schemas.microsoft.com/office/word/2006/wordml" xmlns:wps="http://schemas.microsoft.com/office/word/2010/wordprocessingShape" mc:Ignorable="w14 w15 w16se w16cid w16 w16cex w16sdtdh w16sdtfl w16du wp14">
+<w:document xmlns:wpc="http://schemas.microsoft.com/office/word/2010/wordprocessingCanvas" xmlns:cx="http://schemas.microsoft.com/office/drawing/2014/chartex" xmlns:cx1="http://schemas.microsoft.com/office/drawing/2015/9/8/chartex" xmlns:cx2="http://schemas.microsoft.com/office/drawing/2015/10/21/chartex" xmlns:cx3="http://schemas.microsoft.com/office/drawing/2016/5/9/chartex" xmlns:cx4="http://schemas.microsoft.com/office/drawing/2016/5/10/chartex" xmlns:cx5="http://schemas.microsoft.com/office/drawing/2016/5/11/chartex" xmlns:cx6="http://schemas.microsoft.com/office/drawing/2016/5/12/chartex" xmlns:cx7="http://schemas.microsoft.com/office/drawing/2016/5/13/chartex" xmlns:cx8="http://schemas.microsoft.com/office/drawing/2016/5/14/chartex" xmlns:mc="http://schemas.openxmlformats.org/markup-compatibility/2006" xmlns:aink="http://schemas.microsoft.com/office/drawing/2016/ink" xmlns:am3d="http://schemas.microsoft.com/office/drawing/2017/model3d" xmlns:o="urn:schemas-microsoft-com:office:office" xmlns:oel="http://schemas.microsoft.com/office/2019/extlst" xmlns:r="http://schemas.openxmlformats.org/officeDocument/2006/relationships" xmlns:m="http://schemas.openxmlformats.org/officeDocument/2006/math" xmlns:v="urn:schemas-microsoft-com:vml" xmlns:wp14="http://schemas.microsoft.com/office/word/2010/wordprocessingDrawing" xmlns:wp="http://schemas.openxmlformats.org/drawingml/2006/wordprocessingDrawing" xmlns:w10="urn:schemas-microsoft-com:office:word" xmlns:w="http://schemas.openxmlformats.org/wordprocessingml/2006/main" xmlns:w14="http://schemas.microsoft.com/office/word/2010/wordml" xmlns:w15="http://schemas.microsoft.com/office/word/2012/wordml" xmlns:w16cex="http://schemas.microsoft.com/office/word/2018/wordml/cex" xmlns:w16cid="http://schemas.microsoft.com/office/word/2016/wordml/cid" xmlns:w16="http://schemas.microsoft.com/office/word/2018/wordml" xmlns:w16sdtdh="http://schemas.microsoft.com/office/word/2020/wordml/sdtdatahash" xmlns:w16se="http://schemas.microsoft.com/office/word/2015/wordml/symex" xmlns:wpg="http://schemas.microsoft.com/office/word/2010/wordprocessingGroup" xmlns:wpi="http://schemas.microsoft.com/office/word/2010/wordprocessingInk" xmlns:wne="http://schemas.microsoft.com/office/word/2006/wordml" xmlns:wps="http://schemas.microsoft.com/office/word/2010/wordprocessingShape" mc:Ignorable="w14 w15 w16se w16cid w16 w16cex w16sdtdh wp14">
   <w:background w:color="FFFFFF" w:themeColor="background1"/>
   <w:body>
     <w:p>
@@ -170,7 +170,6 @@
         <w:tblLook w:val="04A0" w:firstRow="1" w:lastRow="0" w:firstColumn="1" w:lastColumn="0" w:noHBand="0" w:noVBand="1"/>
       </w:tblPr>
       <w:tblGrid>
-        <w:gridCol w:w="1242"/>
         <w:gridCol w:w="1843"/>
         <w:gridCol w:w="5635"/>
       </w:tblGrid>
@@ -178,32 +177,6 @@
         <w:trPr>
           <w:trHeight w:hRule="exact" w:val="624"/>
         </w:trPr>
-        <w:tc>
-          <w:tcPr>
-            <w:tcW w:w="1242" w:type="dxa"/>
-            <w:vAlign w:val="center"/>
-          </w:tcPr>
-          <w:p>
-            <w:pPr>
-              <w:adjustRightInd w:val="0"/>
-              <w:snapToGrid w:val="0"/>
-              <w:spacing w:beforeLines="100" w:before="312" w:afterLines="100" w:after="312"/>
-              <w:jc w:val="center"/>
-              <w:outlineLvl w:val="0"/>
-              <w:rPr>
-                <w:rFonts w:asciiTheme="minorEastAsia" w:eastAsiaTheme="minorEastAsia" w:hAnsiTheme="minorEastAsia" w:hint="eastAsia"/>
-                <w:lang w:eastAsia="zh-CN"/>
-              </w:rPr>
-            </w:pPr>
-            <w:r>
-              <w:rPr>
-                <w:rFonts w:asciiTheme="minorEastAsia" w:eastAsiaTheme="minorEastAsia" w:hAnsiTheme="minorEastAsia" w:hint="eastAsia"/>
-                <w:lang w:eastAsia="zh-CN"/>
-              </w:rPr>
-              <w:t>序号</w:t>
-            </w:r>
-          </w:p>
-        </w:tc>
         <w:tc>
           <w:tcPr>
             <w:tcW w:w="1843" w:type="dxa"/>
@@ -258,31 +231,6 @@
         </w:tc>
       </w:tr>
       <w:tr>
-        <w:tc>
-          <w:tcPr>
-            <w:tcW w:w="1242" w:type="dxa"/>
-          </w:tcPr>
-          <w:p>
-            <w:pPr>
-              <w:adjustRightInd w:val="0"/>
-              <w:snapToGrid w:val="0"/>
-              <w:spacing w:beforeLines="100" w:before="312" w:afterLines="100" w:after="312" w:line="440" w:lineRule="exact"/>
-              <w:jc w:val="center"/>
-              <w:outlineLvl w:val="0"/>
-              <w:rPr>
-                <w:rFonts w:asciiTheme="minorEastAsia" w:eastAsiaTheme="minorEastAsia" w:hAnsiTheme="minorEastAsia" w:hint="eastAsia"/>
-                <w:lang w:eastAsia="zh-CN"/>
-              </w:rPr>
-            </w:pPr>
-            <w:r>
-              <w:rPr>
-                <w:rFonts w:asciiTheme="minorEastAsia" w:eastAsiaTheme="minorEastAsia" w:hAnsiTheme="minorEastAsia" w:hint="eastAsia"/>
-                <w:lang w:eastAsia="zh-CN"/>
-              </w:rPr>
-              <w:t>1</w:t>
-            </w:r>
-          </w:p>
-        </w:tc>
         <w:tc>
           <w:tcPr>
             <w:tcW w:w="1843" w:type="dxa"/>
@@ -4949,7 +4897,7 @@
 </file>
 
 <file path=word/endnotes.xml><?xml version="1.0" encoding="utf-8"?>
-<w:endnotes xmlns:wpc="http://schemas.microsoft.com/office/word/2010/wordprocessingCanvas" xmlns:cx="http://schemas.microsoft.com/office/drawing/2014/chartex" xmlns:cx1="http://schemas.microsoft.com/office/drawing/2015/9/8/chartex" xmlns:cx2="http://schemas.microsoft.com/office/drawing/2015/10/21/chartex" xmlns:cx3="http://schemas.microsoft.com/office/drawing/2016/5/9/chartex" xmlns:cx4="http://schemas.microsoft.com/office/drawing/2016/5/10/chartex" xmlns:cx5="http://schemas.microsoft.com/office/drawing/2016/5/11/chartex" xmlns:cx6="http://schemas.microsoft.com/office/drawing/2016/5/12/chartex" xmlns:cx7="http://schemas.microsoft.com/office/drawing/2016/5/13/chartex" xmlns:cx8="http://schemas.microsoft.com/office/drawing/2016/5/14/chartex" xmlns:mc="http://schemas.openxmlformats.org/markup-compatibility/2006" xmlns:aink="http://schemas.microsoft.com/office/drawing/2016/ink" xmlns:am3d="http://schemas.microsoft.com/office/drawing/2017/model3d" xmlns:o="urn:schemas-microsoft-com:office:office" xmlns:oel="http://schemas.microsoft.com/office/2019/extlst" xmlns:r="http://schemas.openxmlformats.org/officeDocument/2006/relationships" xmlns:m="http://schemas.openxmlformats.org/officeDocument/2006/math" xmlns:v="urn:schemas-microsoft-com:vml" xmlns:wp14="http://schemas.microsoft.com/office/word/2010/wordprocessingDrawing" xmlns:wp="http://schemas.openxmlformats.org/drawingml/2006/wordprocessingDrawing" xmlns:w10="urn:schemas-microsoft-com:office:word" xmlns:w="http://schemas.openxmlformats.org/wordprocessingml/2006/main" xmlns:w14="http://schemas.microsoft.com/office/word/2010/wordml" xmlns:w15="http://schemas.microsoft.com/office/word/2012/wordml" xmlns:w16cex="http://schemas.microsoft.com/office/word/2018/wordml/cex" xmlns:w16cid="http://schemas.microsoft.com/office/word/2016/wordml/cid" xmlns:w16="http://schemas.microsoft.com/office/word/2018/wordml" xmlns:w16du="http://schemas.microsoft.com/office/word/2023/wordml/word16du" xmlns:w16sdtdh="http://schemas.microsoft.com/office/word/2020/wordml/sdtdatahash" xmlns:w16sdtfl="http://schemas.microsoft.com/office/word/2024/wordml/sdtformatlock" xmlns:w16se="http://schemas.microsoft.com/office/word/2015/wordml/symex" xmlns:wpg="http://schemas.microsoft.com/office/word/2010/wordprocessingGroup" xmlns:wpi="http://schemas.microsoft.com/office/word/2010/wordprocessingInk" xmlns:wne="http://schemas.microsoft.com/office/word/2006/wordml" xmlns:wps="http://schemas.microsoft.com/office/word/2010/wordprocessingShape" mc:Ignorable="w14 w15 w16se w16cid w16 w16cex w16sdtdh w16sdtfl w16du wp14">
+<w:endnotes xmlns:wpc="http://schemas.microsoft.com/office/word/2010/wordprocessingCanvas" xmlns:cx="http://schemas.microsoft.com/office/drawing/2014/chartex" xmlns:cx1="http://schemas.microsoft.com/office/drawing/2015/9/8/chartex" xmlns:cx2="http://schemas.microsoft.com/office/drawing/2015/10/21/chartex" xmlns:cx3="http://schemas.microsoft.com/office/drawing/2016/5/9/chartex" xmlns:cx4="http://schemas.microsoft.com/office/drawing/2016/5/10/chartex" xmlns:cx5="http://schemas.microsoft.com/office/drawing/2016/5/11/chartex" xmlns:cx6="http://schemas.microsoft.com/office/drawing/2016/5/12/chartex" xmlns:cx7="http://schemas.microsoft.com/office/drawing/2016/5/13/chartex" xmlns:cx8="http://schemas.microsoft.com/office/drawing/2016/5/14/chartex" xmlns:mc="http://schemas.openxmlformats.org/markup-compatibility/2006" xmlns:aink="http://schemas.microsoft.com/office/drawing/2016/ink" xmlns:am3d="http://schemas.microsoft.com/office/drawing/2017/model3d" xmlns:o="urn:schemas-microsoft-com:office:office" xmlns:oel="http://schemas.microsoft.com/office/2019/extlst" xmlns:r="http://schemas.openxmlformats.org/officeDocument/2006/relationships" xmlns:m="http://schemas.openxmlformats.org/officeDocument/2006/math" xmlns:v="urn:schemas-microsoft-com:vml" xmlns:wp14="http://schemas.microsoft.com/office/word/2010/wordprocessingDrawing" xmlns:wp="http://schemas.openxmlformats.org/drawingml/2006/wordprocessingDrawing" xmlns:w10="urn:schemas-microsoft-com:office:word" xmlns:w="http://schemas.openxmlformats.org/wordprocessingml/2006/main" xmlns:w14="http://schemas.microsoft.com/office/word/2010/wordml" xmlns:w15="http://schemas.microsoft.com/office/word/2012/wordml" xmlns:w16cex="http://schemas.microsoft.com/office/word/2018/wordml/cex" xmlns:w16cid="http://schemas.microsoft.com/office/word/2016/wordml/cid" xmlns:w16="http://schemas.microsoft.com/office/word/2018/wordml" xmlns:w16sdtdh="http://schemas.microsoft.com/office/word/2020/wordml/sdtdatahash" xmlns:w16se="http://schemas.microsoft.com/office/word/2015/wordml/symex" xmlns:wpg="http://schemas.microsoft.com/office/word/2010/wordprocessingGroup" xmlns:wpi="http://schemas.microsoft.com/office/word/2010/wordprocessingInk" xmlns:wne="http://schemas.microsoft.com/office/word/2006/wordml" xmlns:wps="http://schemas.microsoft.com/office/word/2010/wordprocessingShape" mc:Ignorable="w14 w15 w16se w16cid w16 w16cex w16sdtdh wp14">
   <w:endnote w:type="separator" w:id="-1">
     <w:p>
       <w:r>
@@ -4968,12 +4916,11 @@
 </file>
 
 <file path=word/footer1.xml><?xml version="1.0" encoding="utf-8"?>
-<w:ftr xmlns:wpc="http://schemas.microsoft.com/office/word/2010/wordprocessingCanvas" xmlns:cx="http://schemas.microsoft.com/office/drawing/2014/chartex" xmlns:cx1="http://schemas.microsoft.com/office/drawing/2015/9/8/chartex" xmlns:cx2="http://schemas.microsoft.com/office/drawing/2015/10/21/chartex" xmlns:cx3="http://schemas.microsoft.com/office/drawing/2016/5/9/chartex" xmlns:cx4="http://schemas.microsoft.com/office/drawing/2016/5/10/chartex" xmlns:cx5="http://schemas.microsoft.com/office/drawing/2016/5/11/chartex" xmlns:cx6="http://schemas.microsoft.com/office/drawing/2016/5/12/chartex" xmlns:cx7="http://schemas.microsoft.com/office/drawing/2016/5/13/chartex" xmlns:cx8="http://schemas.microsoft.com/office/drawing/2016/5/14/chartex" xmlns:mc="http://schemas.openxmlformats.org/markup-compatibility/2006" xmlns:aink="http://schemas.microsoft.com/office/drawing/2016/ink" xmlns:am3d="http://schemas.microsoft.com/office/drawing/2017/model3d" xmlns:o="urn:schemas-microsoft-com:office:office" xmlns:oel="http://schemas.microsoft.com/office/2019/extlst" xmlns:r="http://schemas.openxmlformats.org/officeDocument/2006/relationships" xmlns:m="http://schemas.openxmlformats.org/officeDocument/2006/math" xmlns:v="urn:schemas-microsoft-com:vml" xmlns:wp14="http://schemas.microsoft.com/office/word/2010/wordprocessingDrawing" xmlns:wp="http://schemas.openxmlformats.org/drawingml/2006/wordprocessingDrawing" xmlns:w10="urn:schemas-microsoft-com:office:word" xmlns:w="http://schemas.openxmlformats.org/wordprocessingml/2006/main" xmlns:w14="http://schemas.microsoft.com/office/word/2010/wordml" xmlns:w15="http://schemas.microsoft.com/office/word/2012/wordml" xmlns:w16cex="http://schemas.microsoft.com/office/word/2018/wordml/cex" xmlns:w16cid="http://schemas.microsoft.com/office/word/2016/wordml/cid" xmlns:w16="http://schemas.microsoft.com/office/word/2018/wordml" xmlns:w16du="http://schemas.microsoft.com/office/word/2023/wordml/word16du" xmlns:w16sdtdh="http://schemas.microsoft.com/office/word/2020/wordml/sdtdatahash" xmlns:w16sdtfl="http://schemas.microsoft.com/office/word/2024/wordml/sdtformatlock" xmlns:w16se="http://schemas.microsoft.com/office/word/2015/wordml/symex" xmlns:wpg="http://schemas.microsoft.com/office/word/2010/wordprocessingGroup" xmlns:wpi="http://schemas.microsoft.com/office/word/2010/wordprocessingInk" xmlns:wne="http://schemas.microsoft.com/office/word/2006/wordml" xmlns:wps="http://schemas.microsoft.com/office/word/2010/wordprocessingShape" mc:Ignorable="w14 w15 w16se w16cid w16 w16cex w16sdtdh w16sdtfl w16du wp14">
+<w:ftr xmlns:wpc="http://schemas.microsoft.com/office/word/2010/wordprocessingCanvas" xmlns:cx="http://schemas.microsoft.com/office/drawing/2014/chartex" xmlns:cx1="http://schemas.microsoft.com/office/drawing/2015/9/8/chartex" xmlns:cx2="http://schemas.microsoft.com/office/drawing/2015/10/21/chartex" xmlns:cx3="http://schemas.microsoft.com/office/drawing/2016/5/9/chartex" xmlns:cx4="http://schemas.microsoft.com/office/drawing/2016/5/10/chartex" xmlns:cx5="http://schemas.microsoft.com/office/drawing/2016/5/11/chartex" xmlns:cx6="http://schemas.microsoft.com/office/drawing/2016/5/12/chartex" xmlns:cx7="http://schemas.microsoft.com/office/drawing/2016/5/13/chartex" xmlns:cx8="http://schemas.microsoft.com/office/drawing/2016/5/14/chartex" xmlns:mc="http://schemas.openxmlformats.org/markup-compatibility/2006" xmlns:aink="http://schemas.microsoft.com/office/drawing/2016/ink" xmlns:am3d="http://schemas.microsoft.com/office/drawing/2017/model3d" xmlns:o="urn:schemas-microsoft-com:office:office" xmlns:oel="http://schemas.microsoft.com/office/2019/extlst" xmlns:r="http://schemas.openxmlformats.org/officeDocument/2006/relationships" xmlns:m="http://schemas.openxmlformats.org/officeDocument/2006/math" xmlns:v="urn:schemas-microsoft-com:vml" xmlns:wp14="http://schemas.microsoft.com/office/word/2010/wordprocessingDrawing" xmlns:wp="http://schemas.openxmlformats.org/drawingml/2006/wordprocessingDrawing" xmlns:w10="urn:schemas-microsoft-com:office:word" xmlns:w="http://schemas.openxmlformats.org/wordprocessingml/2006/main" xmlns:w14="http://schemas.microsoft.com/office/word/2010/wordml" xmlns:w15="http://schemas.microsoft.com/office/word/2012/wordml" xmlns:w16cex="http://schemas.microsoft.com/office/word/2018/wordml/cex" xmlns:w16cid="http://schemas.microsoft.com/office/word/2016/wordml/cid" xmlns:w16="http://schemas.microsoft.com/office/word/2018/wordml" xmlns:w16sdtdh="http://schemas.microsoft.com/office/word/2020/wordml/sdtdatahash" xmlns:w16se="http://schemas.microsoft.com/office/word/2015/wordml/symex" xmlns:wpg="http://schemas.microsoft.com/office/word/2010/wordprocessingGroup" xmlns:wpi="http://schemas.microsoft.com/office/word/2010/wordprocessingInk" xmlns:wne="http://schemas.microsoft.com/office/word/2006/wordml" xmlns:wps="http://schemas.microsoft.com/office/word/2010/wordprocessingShape" mc:Ignorable="w14 w15 w16se w16cid w16 w16cex w16sdtdh wp14">
   <w:sdt>
     <w:sdtPr>
       <w:id w:val="-1716195855"/>
     </w:sdtPr>
-    <w:sdtEndPr/>
     <w:sdtContent>
       <w:p>
         <w:pPr>
@@ -5011,7 +4958,7 @@
 </file>
 
 <file path=word/footnotes.xml><?xml version="1.0" encoding="utf-8"?>
-<w:footnotes xmlns:wpc="http://schemas.microsoft.com/office/word/2010/wordprocessingCanvas" xmlns:cx="http://schemas.microsoft.com/office/drawing/2014/chartex" xmlns:cx1="http://schemas.microsoft.com/office/drawing/2015/9/8/chartex" xmlns:cx2="http://schemas.microsoft.com/office/drawing/2015/10/21/chartex" xmlns:cx3="http://schemas.microsoft.com/office/drawing/2016/5/9/chartex" xmlns:cx4="http://schemas.microsoft.com/office/drawing/2016/5/10/chartex" xmlns:cx5="http://schemas.microsoft.com/office/drawing/2016/5/11/chartex" xmlns:cx6="http://schemas.microsoft.com/office/drawing/2016/5/12/chartex" xmlns:cx7="http://schemas.microsoft.com/office/drawing/2016/5/13/chartex" xmlns:cx8="http://schemas.microsoft.com/office/drawing/2016/5/14/chartex" xmlns:mc="http://schemas.openxmlformats.org/markup-compatibility/2006" xmlns:aink="http://schemas.microsoft.com/office/drawing/2016/ink" xmlns:am3d="http://schemas.microsoft.com/office/drawing/2017/model3d" xmlns:o="urn:schemas-microsoft-com:office:office" xmlns:oel="http://schemas.microsoft.com/office/2019/extlst" xmlns:r="http://schemas.openxmlformats.org/officeDocument/2006/relationships" xmlns:m="http://schemas.openxmlformats.org/officeDocument/2006/math" xmlns:v="urn:schemas-microsoft-com:vml" xmlns:wp14="http://schemas.microsoft.com/office/word/2010/wordprocessingDrawing" xmlns:wp="http://schemas.openxmlformats.org/drawingml/2006/wordprocessingDrawing" xmlns:w10="urn:schemas-microsoft-com:office:word" xmlns:w="http://schemas.openxmlformats.org/wordprocessingml/2006/main" xmlns:w14="http://schemas.microsoft.com/office/word/2010/wordml" xmlns:w15="http://schemas.microsoft.com/office/word/2012/wordml" xmlns:w16cex="http://schemas.microsoft.com/office/word/2018/wordml/cex" xmlns:w16cid="http://schemas.microsoft.com/office/word/2016/wordml/cid" xmlns:w16="http://schemas.microsoft.com/office/word/2018/wordml" xmlns:w16du="http://schemas.microsoft.com/office/word/2023/wordml/word16du" xmlns:w16sdtdh="http://schemas.microsoft.com/office/word/2020/wordml/sdtdatahash" xmlns:w16sdtfl="http://schemas.microsoft.com/office/word/2024/wordml/sdtformatlock" xmlns:w16se="http://schemas.microsoft.com/office/word/2015/wordml/symex" xmlns:wpg="http://schemas.microsoft.com/office/word/2010/wordprocessingGroup" xmlns:wpi="http://schemas.microsoft.com/office/word/2010/wordprocessingInk" xmlns:wne="http://schemas.microsoft.com/office/word/2006/wordml" xmlns:wps="http://schemas.microsoft.com/office/word/2010/wordprocessingShape" mc:Ignorable="w14 w15 w16se w16cid w16 w16cex w16sdtdh w16sdtfl w16du wp14">
+<w:footnotes xmlns:wpc="http://schemas.microsoft.com/office/word/2010/wordprocessingCanvas" xmlns:cx="http://schemas.microsoft.com/office/drawing/2014/chartex" xmlns:cx1="http://schemas.microsoft.com/office/drawing/2015/9/8/chartex" xmlns:cx2="http://schemas.microsoft.com/office/drawing/2015/10/21/chartex" xmlns:cx3="http://schemas.microsoft.com/office/drawing/2016/5/9/chartex" xmlns:cx4="http://schemas.microsoft.com/office/drawing/2016/5/10/chartex" xmlns:cx5="http://schemas.microsoft.com/office/drawing/2016/5/11/chartex" xmlns:cx6="http://schemas.microsoft.com/office/drawing/2016/5/12/chartex" xmlns:cx7="http://schemas.microsoft.com/office/drawing/2016/5/13/chartex" xmlns:cx8="http://schemas.microsoft.com/office/drawing/2016/5/14/chartex" xmlns:mc="http://schemas.openxmlformats.org/markup-compatibility/2006" xmlns:aink="http://schemas.microsoft.com/office/drawing/2016/ink" xmlns:am3d="http://schemas.microsoft.com/office/drawing/2017/model3d" xmlns:o="urn:schemas-microsoft-com:office:office" xmlns:oel="http://schemas.microsoft.com/office/2019/extlst" xmlns:r="http://schemas.openxmlformats.org/officeDocument/2006/relationships" xmlns:m="http://schemas.openxmlformats.org/officeDocument/2006/math" xmlns:v="urn:schemas-microsoft-com:vml" xmlns:wp14="http://schemas.microsoft.com/office/word/2010/wordprocessingDrawing" xmlns:wp="http://schemas.openxmlformats.org/drawingml/2006/wordprocessingDrawing" xmlns:w10="urn:schemas-microsoft-com:office:word" xmlns:w="http://schemas.openxmlformats.org/wordprocessingml/2006/main" xmlns:w14="http://schemas.microsoft.com/office/word/2010/wordml" xmlns:w15="http://schemas.microsoft.com/office/word/2012/wordml" xmlns:w16cex="http://schemas.microsoft.com/office/word/2018/wordml/cex" xmlns:w16cid="http://schemas.microsoft.com/office/word/2016/wordml/cid" xmlns:w16="http://schemas.microsoft.com/office/word/2018/wordml" xmlns:w16sdtdh="http://schemas.microsoft.com/office/word/2020/wordml/sdtdatahash" xmlns:w16se="http://schemas.microsoft.com/office/word/2015/wordml/symex" xmlns:wpg="http://schemas.microsoft.com/office/word/2010/wordprocessingGroup" xmlns:wpi="http://schemas.microsoft.com/office/word/2010/wordprocessingInk" xmlns:wne="http://schemas.microsoft.com/office/word/2006/wordml" xmlns:wps="http://schemas.microsoft.com/office/word/2010/wordprocessingShape" mc:Ignorable="w14 w15 w16se w16cid w16 w16cex w16sdtdh wp14">
   <w:footnote w:type="separator" w:id="-1">
     <w:p>
       <w:r>
@@ -5030,7 +4977,7 @@
 </file>
 
 <file path=word/header1.xml><?xml version="1.0" encoding="utf-8"?>
-<w:hdr xmlns:wpc="http://schemas.microsoft.com/office/word/2010/wordprocessingCanvas" xmlns:cx="http://schemas.microsoft.com/office/drawing/2014/chartex" xmlns:cx1="http://schemas.microsoft.com/office/drawing/2015/9/8/chartex" xmlns:cx2="http://schemas.microsoft.com/office/drawing/2015/10/21/chartex" xmlns:cx3="http://schemas.microsoft.com/office/drawing/2016/5/9/chartex" xmlns:cx4="http://schemas.microsoft.com/office/drawing/2016/5/10/chartex" xmlns:cx5="http://schemas.microsoft.com/office/drawing/2016/5/11/chartex" xmlns:cx6="http://schemas.microsoft.com/office/drawing/2016/5/12/chartex" xmlns:cx7="http://schemas.microsoft.com/office/drawing/2016/5/13/chartex" xmlns:cx8="http://schemas.microsoft.com/office/drawing/2016/5/14/chartex" xmlns:mc="http://schemas.openxmlformats.org/markup-compatibility/2006" xmlns:aink="http://schemas.microsoft.com/office/drawing/2016/ink" xmlns:am3d="http://schemas.microsoft.com/office/drawing/2017/model3d" xmlns:o="urn:schemas-microsoft-com:office:office" xmlns:oel="http://schemas.microsoft.com/office/2019/extlst" xmlns:r="http://schemas.openxmlformats.org/officeDocument/2006/relationships" xmlns:m="http://schemas.openxmlformats.org/officeDocument/2006/math" xmlns:v="urn:schemas-microsoft-com:vml" xmlns:wp14="http://schemas.microsoft.com/office/word/2010/wordprocessingDrawing" xmlns:wp="http://schemas.openxmlformats.org/drawingml/2006/wordprocessingDrawing" xmlns:w10="urn:schemas-microsoft-com:office:word" xmlns:w="http://schemas.openxmlformats.org/wordprocessingml/2006/main" xmlns:w14="http://schemas.microsoft.com/office/word/2010/wordml" xmlns:w15="http://schemas.microsoft.com/office/word/2012/wordml" xmlns:w16cex="http://schemas.microsoft.com/office/word/2018/wordml/cex" xmlns:w16cid="http://schemas.microsoft.com/office/word/2016/wordml/cid" xmlns:w16="http://schemas.microsoft.com/office/word/2018/wordml" xmlns:w16du="http://schemas.microsoft.com/office/word/2023/wordml/word16du" xmlns:w16sdtdh="http://schemas.microsoft.com/office/word/2020/wordml/sdtdatahash" xmlns:w16sdtfl="http://schemas.microsoft.com/office/word/2024/wordml/sdtformatlock" xmlns:w16se="http://schemas.microsoft.com/office/word/2015/wordml/symex" xmlns:wpg="http://schemas.microsoft.com/office/word/2010/wordprocessingGroup" xmlns:wpi="http://schemas.microsoft.com/office/word/2010/wordprocessingInk" xmlns:wne="http://schemas.microsoft.com/office/word/2006/wordml" xmlns:wps="http://schemas.microsoft.com/office/word/2010/wordprocessingShape" mc:Ignorable="w14 w15 w16se w16cid w16 w16cex w16sdtdh w16sdtfl w16du wp14">
+<w:hdr xmlns:wpc="http://schemas.microsoft.com/office/word/2010/wordprocessingCanvas" xmlns:cx="http://schemas.microsoft.com/office/drawing/2014/chartex" xmlns:cx1="http://schemas.microsoft.com/office/drawing/2015/9/8/chartex" xmlns:cx2="http://schemas.microsoft.com/office/drawing/2015/10/21/chartex" xmlns:cx3="http://schemas.microsoft.com/office/drawing/2016/5/9/chartex" xmlns:cx4="http://schemas.microsoft.com/office/drawing/2016/5/10/chartex" xmlns:cx5="http://schemas.microsoft.com/office/drawing/2016/5/11/chartex" xmlns:cx6="http://schemas.microsoft.com/office/drawing/2016/5/12/chartex" xmlns:cx7="http://schemas.microsoft.com/office/drawing/2016/5/13/chartex" xmlns:cx8="http://schemas.microsoft.com/office/drawing/2016/5/14/chartex" xmlns:mc="http://schemas.openxmlformats.org/markup-compatibility/2006" xmlns:aink="http://schemas.microsoft.com/office/drawing/2016/ink" xmlns:am3d="http://schemas.microsoft.com/office/drawing/2017/model3d" xmlns:o="urn:schemas-microsoft-com:office:office" xmlns:oel="http://schemas.microsoft.com/office/2019/extlst" xmlns:r="http://schemas.openxmlformats.org/officeDocument/2006/relationships" xmlns:m="http://schemas.openxmlformats.org/officeDocument/2006/math" xmlns:v="urn:schemas-microsoft-com:vml" xmlns:wp14="http://schemas.microsoft.com/office/word/2010/wordprocessingDrawing" xmlns:wp="http://schemas.openxmlformats.org/drawingml/2006/wordprocessingDrawing" xmlns:w10="urn:schemas-microsoft-com:office:word" xmlns:w="http://schemas.openxmlformats.org/wordprocessingml/2006/main" xmlns:w14="http://schemas.microsoft.com/office/word/2010/wordml" xmlns:w15="http://schemas.microsoft.com/office/word/2012/wordml" xmlns:w16cex="http://schemas.microsoft.com/office/word/2018/wordml/cex" xmlns:w16cid="http://schemas.microsoft.com/office/word/2016/wordml/cid" xmlns:w16="http://schemas.microsoft.com/office/word/2018/wordml" xmlns:w16sdtdh="http://schemas.microsoft.com/office/word/2020/wordml/sdtdatahash" xmlns:w16se="http://schemas.microsoft.com/office/word/2015/wordml/symex" xmlns:wpg="http://schemas.microsoft.com/office/word/2010/wordprocessingGroup" xmlns:wpi="http://schemas.microsoft.com/office/word/2010/wordprocessingInk" xmlns:wne="http://schemas.microsoft.com/office/word/2006/wordml" xmlns:wps="http://schemas.microsoft.com/office/word/2010/wordprocessingShape" mc:Ignorable="w14 w15 w16se w16cid w16 w16cex w16sdtdh wp14">
   <w:tbl>
     <w:tblPr>
       <w:tblpPr w:leftFromText="180" w:rightFromText="180" w:vertAnchor="text" w:horzAnchor="margin" w:tblpX="-32" w:tblpY="624"/>
@@ -5440,7 +5387,7 @@
 </file>
 
 <file path=word/header2.xml><?xml version="1.0" encoding="utf-8"?>
-<w:hdr xmlns:wpc="http://schemas.microsoft.com/office/word/2010/wordprocessingCanvas" xmlns:cx="http://schemas.microsoft.com/office/drawing/2014/chartex" xmlns:cx1="http://schemas.microsoft.com/office/drawing/2015/9/8/chartex" xmlns:cx2="http://schemas.microsoft.com/office/drawing/2015/10/21/chartex" xmlns:cx3="http://schemas.microsoft.com/office/drawing/2016/5/9/chartex" xmlns:cx4="http://schemas.microsoft.com/office/drawing/2016/5/10/chartex" xmlns:cx5="http://schemas.microsoft.com/office/drawing/2016/5/11/chartex" xmlns:cx6="http://schemas.microsoft.com/office/drawing/2016/5/12/chartex" xmlns:cx7="http://schemas.microsoft.com/office/drawing/2016/5/13/chartex" xmlns:cx8="http://schemas.microsoft.com/office/drawing/2016/5/14/chartex" xmlns:mc="http://schemas.openxmlformats.org/markup-compatibility/2006" xmlns:aink="http://schemas.microsoft.com/office/drawing/2016/ink" xmlns:am3d="http://schemas.microsoft.com/office/drawing/2017/model3d" xmlns:o="urn:schemas-microsoft-com:office:office" xmlns:oel="http://schemas.microsoft.com/office/2019/extlst" xmlns:r="http://schemas.openxmlformats.org/officeDocument/2006/relationships" xmlns:m="http://schemas.openxmlformats.org/officeDocument/2006/math" xmlns:v="urn:schemas-microsoft-com:vml" xmlns:wp14="http://schemas.microsoft.com/office/word/2010/wordprocessingDrawing" xmlns:wp="http://schemas.openxmlformats.org/drawingml/2006/wordprocessingDrawing" xmlns:w10="urn:schemas-microsoft-com:office:word" xmlns:w="http://schemas.openxmlformats.org/wordprocessingml/2006/main" xmlns:w14="http://schemas.microsoft.com/office/word/2010/wordml" xmlns:w15="http://schemas.microsoft.com/office/word/2012/wordml" xmlns:w16cex="http://schemas.microsoft.com/office/word/2018/wordml/cex" xmlns:w16cid="http://schemas.microsoft.com/office/word/2016/wordml/cid" xmlns:w16="http://schemas.microsoft.com/office/word/2018/wordml" xmlns:w16du="http://schemas.microsoft.com/office/word/2023/wordml/word16du" xmlns:w16sdtdh="http://schemas.microsoft.com/office/word/2020/wordml/sdtdatahash" xmlns:w16sdtfl="http://schemas.microsoft.com/office/word/2024/wordml/sdtformatlock" xmlns:w16se="http://schemas.microsoft.com/office/word/2015/wordml/symex" xmlns:wpg="http://schemas.microsoft.com/office/word/2010/wordprocessingGroup" xmlns:wpi="http://schemas.microsoft.com/office/word/2010/wordprocessingInk" xmlns:wne="http://schemas.microsoft.com/office/word/2006/wordml" xmlns:wps="http://schemas.microsoft.com/office/word/2010/wordprocessingShape" mc:Ignorable="w14 w15 w16se w16cid w16 w16cex w16sdtdh w16sdtfl w16du wp14">
+<w:hdr xmlns:wpc="http://schemas.microsoft.com/office/word/2010/wordprocessingCanvas" xmlns:cx="http://schemas.microsoft.com/office/drawing/2014/chartex" xmlns:cx1="http://schemas.microsoft.com/office/drawing/2015/9/8/chartex" xmlns:cx2="http://schemas.microsoft.com/office/drawing/2015/10/21/chartex" xmlns:cx3="http://schemas.microsoft.com/office/drawing/2016/5/9/chartex" xmlns:cx4="http://schemas.microsoft.com/office/drawing/2016/5/10/chartex" xmlns:cx5="http://schemas.microsoft.com/office/drawing/2016/5/11/chartex" xmlns:cx6="http://schemas.microsoft.com/office/drawing/2016/5/12/chartex" xmlns:cx7="http://schemas.microsoft.com/office/drawing/2016/5/13/chartex" xmlns:cx8="http://schemas.microsoft.com/office/drawing/2016/5/14/chartex" xmlns:mc="http://schemas.openxmlformats.org/markup-compatibility/2006" xmlns:aink="http://schemas.microsoft.com/office/drawing/2016/ink" xmlns:am3d="http://schemas.microsoft.com/office/drawing/2017/model3d" xmlns:o="urn:schemas-microsoft-com:office:office" xmlns:oel="http://schemas.microsoft.com/office/2019/extlst" xmlns:r="http://schemas.openxmlformats.org/officeDocument/2006/relationships" xmlns:m="http://schemas.openxmlformats.org/officeDocument/2006/math" xmlns:v="urn:schemas-microsoft-com:vml" xmlns:wp14="http://schemas.microsoft.com/office/word/2010/wordprocessingDrawing" xmlns:wp="http://schemas.openxmlformats.org/drawingml/2006/wordprocessingDrawing" xmlns:w10="urn:schemas-microsoft-com:office:word" xmlns:w="http://schemas.openxmlformats.org/wordprocessingml/2006/main" xmlns:w14="http://schemas.microsoft.com/office/word/2010/wordml" xmlns:w15="http://schemas.microsoft.com/office/word/2012/wordml" xmlns:w16cex="http://schemas.microsoft.com/office/word/2018/wordml/cex" xmlns:w16cid="http://schemas.microsoft.com/office/word/2016/wordml/cid" xmlns:w16="http://schemas.microsoft.com/office/word/2018/wordml" xmlns:w16sdtdh="http://schemas.microsoft.com/office/word/2020/wordml/sdtdatahash" xmlns:w16se="http://schemas.microsoft.com/office/word/2015/wordml/symex" xmlns:wpg="http://schemas.microsoft.com/office/word/2010/wordprocessingGroup" xmlns:wpi="http://schemas.microsoft.com/office/word/2010/wordprocessingInk" xmlns:wne="http://schemas.microsoft.com/office/word/2006/wordml" xmlns:wps="http://schemas.microsoft.com/office/word/2010/wordprocessingShape" mc:Ignorable="w14 w15 w16se w16cid w16 w16cex w16sdtdh wp14">
   <w:tbl>
     <w:tblPr>
       <w:tblpPr w:leftFromText="180" w:rightFromText="180" w:vertAnchor="text" w:horzAnchor="margin" w:tblpX="-32" w:tblpY="624"/>
@@ -5822,7 +5769,7 @@
 </file>
 
 <file path=word/numbering.xml><?xml version="1.0" encoding="utf-8"?>
-<w:numbering xmlns:wpc="http://schemas.microsoft.com/office/word/2010/wordprocessingCanvas" xmlns:cx="http://schemas.microsoft.com/office/drawing/2014/chartex" xmlns:cx1="http://schemas.microsoft.com/office/drawing/2015/9/8/chartex" xmlns:cx2="http://schemas.microsoft.com/office/drawing/2015/10/21/chartex" xmlns:cx3="http://schemas.microsoft.com/office/drawing/2016/5/9/chartex" xmlns:cx4="http://schemas.microsoft.com/office/drawing/2016/5/10/chartex" xmlns:cx5="http://schemas.microsoft.com/office/drawing/2016/5/11/chartex" xmlns:cx6="http://schemas.microsoft.com/office/drawing/2016/5/12/chartex" xmlns:cx7="http://schemas.microsoft.com/office/drawing/2016/5/13/chartex" xmlns:cx8="http://schemas.microsoft.com/office/drawing/2016/5/14/chartex" xmlns:mc="http://schemas.openxmlformats.org/markup-compatibility/2006" xmlns:aink="http://schemas.microsoft.com/office/drawing/2016/ink" xmlns:am3d="http://schemas.microsoft.com/office/drawing/2017/model3d" xmlns:o="urn:schemas-microsoft-com:office:office" xmlns:oel="http://schemas.microsoft.com/office/2019/extlst" xmlns:r="http://schemas.openxmlformats.org/officeDocument/2006/relationships" xmlns:m="http://schemas.openxmlformats.org/officeDocument/2006/math" xmlns:v="urn:schemas-microsoft-com:vml" xmlns:wp14="http://schemas.microsoft.com/office/word/2010/wordprocessingDrawing" xmlns:wp="http://schemas.openxmlformats.org/drawingml/2006/wordprocessingDrawing" xmlns:w10="urn:schemas-microsoft-com:office:word" xmlns:w="http://schemas.openxmlformats.org/wordprocessingml/2006/main" xmlns:w14="http://schemas.microsoft.com/office/word/2010/wordml" xmlns:w15="http://schemas.microsoft.com/office/word/2012/wordml" xmlns:w16cex="http://schemas.microsoft.com/office/word/2018/wordml/cex" xmlns:w16cid="http://schemas.microsoft.com/office/word/2016/wordml/cid" xmlns:w16="http://schemas.microsoft.com/office/word/2018/wordml" xmlns:w16du="http://schemas.microsoft.com/office/word/2023/wordml/word16du" xmlns:w16sdtdh="http://schemas.microsoft.com/office/word/2020/wordml/sdtdatahash" xmlns:w16sdtfl="http://schemas.microsoft.com/office/word/2024/wordml/sdtformatlock" xmlns:w16se="http://schemas.microsoft.com/office/word/2015/wordml/symex" xmlns:wpg="http://schemas.microsoft.com/office/word/2010/wordprocessingGroup" xmlns:wpi="http://schemas.microsoft.com/office/word/2010/wordprocessingInk" xmlns:wne="http://schemas.microsoft.com/office/word/2006/wordml" xmlns:wps="http://schemas.microsoft.com/office/word/2010/wordprocessingShape" mc:Ignorable="w14 w15 w16se w16cid w16 w16cex w16sdtdh w16sdtfl w16du wp14">
+<w:numbering xmlns:wpc="http://schemas.microsoft.com/office/word/2010/wordprocessingCanvas" xmlns:cx="http://schemas.microsoft.com/office/drawing/2014/chartex" xmlns:cx1="http://schemas.microsoft.com/office/drawing/2015/9/8/chartex" xmlns:cx2="http://schemas.microsoft.com/office/drawing/2015/10/21/chartex" xmlns:cx3="http://schemas.microsoft.com/office/drawing/2016/5/9/chartex" xmlns:cx4="http://schemas.microsoft.com/office/drawing/2016/5/10/chartex" xmlns:cx5="http://schemas.microsoft.com/office/drawing/2016/5/11/chartex" xmlns:cx6="http://schemas.microsoft.com/office/drawing/2016/5/12/chartex" xmlns:cx7="http://schemas.microsoft.com/office/drawing/2016/5/13/chartex" xmlns:cx8="http://schemas.microsoft.com/office/drawing/2016/5/14/chartex" xmlns:mc="http://schemas.openxmlformats.org/markup-compatibility/2006" xmlns:aink="http://schemas.microsoft.com/office/drawing/2016/ink" xmlns:am3d="http://schemas.microsoft.com/office/drawing/2017/model3d" xmlns:o="urn:schemas-microsoft-com:office:office" xmlns:oel="http://schemas.microsoft.com/office/2019/extlst" xmlns:r="http://schemas.openxmlformats.org/officeDocument/2006/relationships" xmlns:m="http://schemas.openxmlformats.org/officeDocument/2006/math" xmlns:v="urn:schemas-microsoft-com:vml" xmlns:wp14="http://schemas.microsoft.com/office/word/2010/wordprocessingDrawing" xmlns:wp="http://schemas.openxmlformats.org/drawingml/2006/wordprocessingDrawing" xmlns:w10="urn:schemas-microsoft-com:office:word" xmlns:w="http://schemas.openxmlformats.org/wordprocessingml/2006/main" xmlns:w14="http://schemas.microsoft.com/office/word/2010/wordml" xmlns:w15="http://schemas.microsoft.com/office/word/2012/wordml" xmlns:w16cex="http://schemas.microsoft.com/office/word/2018/wordml/cex" xmlns:w16cid="http://schemas.microsoft.com/office/word/2016/wordml/cid" xmlns:w16="http://schemas.microsoft.com/office/word/2018/wordml" xmlns:w16sdtdh="http://schemas.microsoft.com/office/word/2020/wordml/sdtdatahash" xmlns:w16se="http://schemas.microsoft.com/office/word/2015/wordml/symex" xmlns:wpg="http://schemas.microsoft.com/office/word/2010/wordprocessingGroup" xmlns:wpi="http://schemas.microsoft.com/office/word/2010/wordprocessingInk" xmlns:wne="http://schemas.microsoft.com/office/word/2006/wordml" xmlns:wps="http://schemas.microsoft.com/office/word/2010/wordprocessingShape" mc:Ignorable="w14 w15 w16se w16cid w16 w16cex w16sdtdh wp14">
   <w:abstractNum w:abstractNumId="0" w15:restartNumberingAfterBreak="0">
     <w:nsid w:val="31723022"/>
     <w:multiLevelType w:val="multilevel"/>
@@ -5919,7 +5866,7 @@
 </file>
 
 <file path=word/styles.xml><?xml version="1.0" encoding="utf-8"?>
-<w:styles xmlns:mc="http://schemas.openxmlformats.org/markup-compatibility/2006" xmlns:r="http://schemas.openxmlformats.org/officeDocument/2006/relationships" xmlns:w="http://schemas.openxmlformats.org/wordprocessingml/2006/main" xmlns:w14="http://schemas.microsoft.com/office/word/2010/wordml" xmlns:w15="http://schemas.microsoft.com/office/word/2012/wordml" xmlns:w16cex="http://schemas.microsoft.com/office/word/2018/wordml/cex" xmlns:w16cid="http://schemas.microsoft.com/office/word/2016/wordml/cid" xmlns:w16="http://schemas.microsoft.com/office/word/2018/wordml" xmlns:w16du="http://schemas.microsoft.com/office/word/2023/wordml/word16du" xmlns:w16sdtdh="http://schemas.microsoft.com/office/word/2020/wordml/sdtdatahash" xmlns:w16sdtfl="http://schemas.microsoft.com/office/word/2024/wordml/sdtformatlock" xmlns:w16se="http://schemas.microsoft.com/office/word/2015/wordml/symex" mc:Ignorable="w14 w15 w16se w16cid w16 w16cex w16sdtdh w16sdtfl w16du">
+<w:styles xmlns:mc="http://schemas.openxmlformats.org/markup-compatibility/2006" xmlns:r="http://schemas.openxmlformats.org/officeDocument/2006/relationships" xmlns:w="http://schemas.openxmlformats.org/wordprocessingml/2006/main" xmlns:w14="http://schemas.microsoft.com/office/word/2010/wordml" xmlns:w15="http://schemas.microsoft.com/office/word/2012/wordml" xmlns:w16cex="http://schemas.microsoft.com/office/word/2018/wordml/cex" xmlns:w16cid="http://schemas.microsoft.com/office/word/2016/wordml/cid" xmlns:w16="http://schemas.microsoft.com/office/word/2018/wordml" xmlns:w16sdtdh="http://schemas.microsoft.com/office/word/2020/wordml/sdtdatahash" xmlns:w16se="http://schemas.microsoft.com/office/word/2015/wordml/symex" mc:Ignorable="w14 w15 w16se w16cid w16 w16cex w16sdtdh">
   <w:docDefaults>
     <w:rPrDefault>
       <w:rPr>

</xml_diff>